<commit_message>
week 2 report updated'
</commit_message>
<xml_diff>
--- a/Submission/Week_2_NLP_Report_Duplicate_Question_Detection.docx
+++ b/Submission/Week_2_NLP_Report_Duplicate_Question_Detection.docx
@@ -18,6 +18,10 @@
     <w:p>
       <w:pPr>
         <w:jc w:val="center"/>
+        <w:rPr>
+          <w:i/>
+          <w:sz w:val="21"/>
+        </w:rPr>
       </w:pPr>
       <w:r>
         <w:rPr>
@@ -26,17 +30,12 @@
         </w:rPr>
         <w:t>Duplicate Question Detection using NLP</w:t>
       </w:r>
-    </w:p>
-    <w:p>
-      <w:pPr>
-        <w:jc w:val="center"/>
-      </w:pPr>
       <w:r>
         <w:rPr>
-          <w:color w:val="646464"/>
-          <w:sz w:val="17"/>
+          <w:i/>
+          <w:sz w:val="21"/>
         </w:rPr>
-        <w:t>Internship Report | Week 2 | Hugging Face Quora Duplicate Questions Dataset</w:t>
+        <w:t xml:space="preserve">    </w:t>
       </w:r>
     </w:p>
     <w:p/>
@@ -51,7 +50,7 @@
     </w:p>
     <w:p>
       <w:r>
-        <w:t>Week 2 established a strong classical baseline for duplicate question detection using TF-IDF features with Logistic Regression and Linear SVM. On 404,290 Quora question pairs, the best model achieved 74.16% accuracy. The analysis shows that classical NLP is effective for word overlap, however it fails to generalize well when duplicate questions are phrased differently.</w:t>
+        <w:t>Week 2 delivered a strong classical baseline for duplicate question detection. Using TF-IDF features with Logistic Regression and Linear SVM, the best model achieved 0.7416 accuracy on 404,290 Quora question pairs. The results confirm that classical NLP performs well on lexical overlap, however it fails to generalize when semantically similar questions use different wording.</w:t>
       </w:r>
     </w:p>
     <w:p>
@@ -65,7 +64,7 @@
     </w:p>
     <w:p>
       <w:r>
-        <w:t>The objective is to identify semantically equivalent questions so duplicate answers can be consolidated and search results can be improved. This is a standard text similarity task where lexical overlap provides useful signal, but semantic understanding remains necessary for paraphrased questions.</w:t>
+        <w:t>The objective is to identify semantically equivalent questions to reduce redundancy and improve search quality. This task is a standard text similarity problem where surface-level term overlap is useful but incomplete for paraphrased questions.</w:t>
       </w:r>
     </w:p>
     <w:p>
@@ -82,7 +81,7 @@
         <w:pStyle w:val="ListBullet"/>
       </w:pPr>
       <w:r>
-        <w:t>Dataset source: sentence-transformers/quora-duplicates on Hugging Face.</w:t>
+        <w:t>Dataset source: sentence-transformers/quora-duplicates (pair-class) on Hugging Face.</w:t>
       </w:r>
     </w:p>
     <w:p>
@@ -90,7 +89,7 @@
         <w:pStyle w:val="ListBullet"/>
       </w:pPr>
       <w:r>
-        <w:t>Dataset size: 404,290 question pairs.</w:t>
+        <w:t>Dataset size: 404,290 question pairs with a 63.1%/36.9% non-duplicate/duplicate split.</w:t>
       </w:r>
     </w:p>
     <w:p>
@@ -98,7 +97,10 @@
         <w:pStyle w:val="ListBullet"/>
       </w:pPr>
       <w:r>
-        <w:t>Class balance: 63.1% non-duplicates and 36.9% duplicates.</w:t>
+        <w:t xml:space="preserve">Preprocessing: </w:t>
+      </w:r>
+      <w:r>
+        <w:t>removed null values, removed duplicate rows, lowercased all text, removed special characters, and filtered empty question pairs</w:t>
       </w:r>
     </w:p>
     <w:p>
@@ -106,12 +108,7 @@
         <w:pStyle w:val="ListBullet"/>
       </w:pPr>
       <w:r>
-        <w:t>Preprocessing: removed nulls, removed duplicate rows, lowercased text, removed special characters, and prepared cleaned question pairs.</w:t>
-      </w:r>
-    </w:p>
-    <w:p>
-      <w:r>
-        <w:t>Text preprocessing converted the raw question text into a consistent format before modeling. TF-IDF vectorization was then applied with unigrams and bigrams so the model could capture both individual words and short phrase patterns. The question pairs were represented as separate TF-IDF vectors and concatenated into a sparse feature matrix. The dataset was split using an 80/20 stratified train-test split, and Logistic Regression plus Linear SVM were trained on the same training set for a fair comparison.</w:t>
+        <w:t>TF-IDF features were generated with unigrams and bigrams to capture single-word and short-phrase signals. Each question pair was vectorized separately and concatenated into a sparse feature matrix. The dataset was split into an 80/20 stratified train-test split to preserve label balance, and both Logistic Regression and Linear SVM were trained on the same split for a fair comparison.</w:t>
       </w:r>
     </w:p>
     <w:p>
@@ -123,8 +120,8 @@
           <w:noProof/>
         </w:rPr>
         <w:drawing>
-          <wp:inline distT="0" distB="0" distL="0" distR="0" wp14:anchorId="33FA402F" wp14:editId="227D1F5F">
-            <wp:extent cx="5852160" cy="1952574"/>
+          <wp:inline distT="0" distB="0" distL="0" distR="0" wp14:anchorId="61D32E7F" wp14:editId="7DABB006">
+            <wp:extent cx="5806440" cy="1988352"/>
             <wp:effectExtent l="0" t="0" r="0" b="0"/>
             <wp:docPr id="1" name="Picture 1"/>
             <wp:cNvGraphicFramePr>
@@ -146,7 +143,7 @@
                   <pic:spPr>
                     <a:xfrm>
                       <a:off x="0" y="0"/>
-                      <a:ext cx="5852160" cy="1952574"/>
+                      <a:ext cx="5806440" cy="1988352"/>
                     </a:xfrm>
                     <a:prstGeom prst="rect">
                       <a:avLst/>
@@ -173,11 +170,23 @@
     </w:p>
     <w:p>
       <w:pPr>
+        <w:jc w:val="center"/>
+      </w:pPr>
+      <w:r>
+        <w:rPr>
+          <w:i/>
+          <w:sz w:val="16"/>
+        </w:rPr>
+        <w:t>Interpretation: The dataset is moderately imbalanced, and high-scoring TF-IDF terms capture frequent question themes.</w:t>
+      </w:r>
+    </w:p>
+    <w:p>
+      <w:pPr>
         <w:pStyle w:val="Heading1"/>
         <w:shd w:val="clear" w:color="auto" w:fill="E8F1FB"/>
       </w:pPr>
       <w:r>
-        <w:t>4. Methodology</w:t>
+        <w:t>4. Feature Engineering</w:t>
       </w:r>
     </w:p>
     <w:p>
@@ -185,7 +194,13 @@
         <w:pStyle w:val="ListBullet"/>
       </w:pPr>
       <w:r>
-        <w:t>TF-IDF with unigrams and bigrams was used to capture both single-word signals and short phrase context.</w:t>
+        <w:t xml:space="preserve">TF-IDF Vectorization: </w:t>
+      </w:r>
+      <w:r>
+        <w:t>TF-IDF Vectorization: converts questions into weighted term vectors, where each term is scored by its frequency in the question relative to its rarity across the full corpus.</w:t>
+      </w:r>
+      <w:r>
+        <w:t>.</w:t>
       </w:r>
     </w:p>
     <w:p>
@@ -193,7 +208,7 @@
         <w:pStyle w:val="ListBullet"/>
       </w:pPr>
       <w:r>
-        <w:t>Logistic Regression was used as a fast, interpretable binary classifier.</w:t>
+        <w:t>Unigrams and Bigrams: unigrams capture word-level signals, while bigrams capture short phrase context.</w:t>
       </w:r>
     </w:p>
     <w:p>
@@ -201,7 +216,15 @@
         <w:pStyle w:val="ListBullet"/>
       </w:pPr>
       <w:r>
-        <w:t>Linear SVM was used because it performs well on sparse, high-dimensional text features.</w:t>
+        <w:t>Why TF-IDF: it produces sparse, interpretable features that work well with linear classifiers on large text corpora, and directly captures the lexical overlap signal that dominates this dataset.</w:t>
+      </w:r>
+    </w:p>
+    <w:p>
+      <w:pPr>
+        <w:pStyle w:val="ListBullet"/>
+      </w:pPr>
+      <w:r>
+        <w:t>Word2Vec Embeddings: dense vectors that capture semantic relationships and synonymy beyond exact word overlap.</w:t>
       </w:r>
     </w:p>
     <w:p>
@@ -211,12 +234,48 @@
       </w:pPr>
       <w:r>
         <w:lastRenderedPageBreak/>
-        <w:t>5. Key Results</w:t>
+        <w:t>5. Model Development</w:t>
       </w:r>
     </w:p>
     <w:p>
+      <w:pPr>
+        <w:pStyle w:val="ListBullet"/>
+      </w:pPr>
       <w:r>
-        <w:t>Logistic Regression achieved 74.16% accuracy and an F1 score of 0.5906. Linear SVM achieved 74.03% accuracy and an F1 score of 0.5866. Logistic Regression is the best-performing model in this Week 2 comparison, but the difference is small.</w:t>
+        <w:t>TF-IDF + Logistic Regression: strong baseline with calibrated probabilities.</w:t>
+      </w:r>
+    </w:p>
+    <w:p>
+      <w:pPr>
+        <w:pStyle w:val="ListBullet"/>
+      </w:pPr>
+      <w:r>
+        <w:t>TF-IDF + Linear SVM: robust on high-dimensional sparse features.</w:t>
+      </w:r>
+    </w:p>
+    <w:p>
+      <w:pPr>
+        <w:pStyle w:val="ListBullet"/>
+      </w:pPr>
+      <w:r>
+        <w:t>Word2Vec + Logistic Regression: embedding-based model for semantic similarity.</w:t>
+      </w:r>
+    </w:p>
+    <w:p>
+      <w:pPr>
+        <w:pStyle w:val="ListBullet"/>
+      </w:pPr>
+      <w:r>
+        <w:t>Word2Vec + Linear SVM: complementary embedding-based baseline.</w:t>
+      </w:r>
+    </w:p>
+    <w:p>
+      <w:pPr>
+        <w:pStyle w:val="Heading1"/>
+        <w:shd w:val="clear" w:color="auto" w:fill="E8F1FB"/>
+      </w:pPr>
+      <w:r>
+        <w:t>6. Results</w:t>
       </w:r>
     </w:p>
     <w:tbl>
@@ -226,16 +285,16 @@
         <w:tblLook w:val="04A0" w:firstRow="1" w:lastRow="0" w:firstColumn="1" w:lastColumn="0" w:noHBand="0" w:noVBand="1"/>
       </w:tblPr>
       <w:tblGrid>
-        <w:gridCol w:w="2102"/>
-        <w:gridCol w:w="2102"/>
-        <w:gridCol w:w="2102"/>
-        <w:gridCol w:w="2102"/>
-        <w:gridCol w:w="2102"/>
+        <w:gridCol w:w="2074"/>
+        <w:gridCol w:w="2074"/>
+        <w:gridCol w:w="2074"/>
+        <w:gridCol w:w="2074"/>
+        <w:gridCol w:w="2074"/>
       </w:tblGrid>
       <w:tr>
         <w:tc>
           <w:tcPr>
-            <w:tcW w:w="2102" w:type="dxa"/>
+            <w:tcW w:w="2074" w:type="dxa"/>
           </w:tcPr>
           <w:p>
             <w:r>
@@ -249,7 +308,7 @@
         </w:tc>
         <w:tc>
           <w:tcPr>
-            <w:tcW w:w="2102" w:type="dxa"/>
+            <w:tcW w:w="2074" w:type="dxa"/>
           </w:tcPr>
           <w:p>
             <w:r>
@@ -263,7 +322,7 @@
         </w:tc>
         <w:tc>
           <w:tcPr>
-            <w:tcW w:w="2102" w:type="dxa"/>
+            <w:tcW w:w="2074" w:type="dxa"/>
           </w:tcPr>
           <w:p>
             <w:r>
@@ -277,7 +336,7 @@
         </w:tc>
         <w:tc>
           <w:tcPr>
-            <w:tcW w:w="2102" w:type="dxa"/>
+            <w:tcW w:w="2074" w:type="dxa"/>
           </w:tcPr>
           <w:p>
             <w:r>
@@ -291,7 +350,7 @@
         </w:tc>
         <w:tc>
           <w:tcPr>
-            <w:tcW w:w="2102" w:type="dxa"/>
+            <w:tcW w:w="2074" w:type="dxa"/>
           </w:tcPr>
           <w:p>
             <w:r>
@@ -307,7 +366,7 @@
       <w:tr>
         <w:tc>
           <w:tcPr>
-            <w:tcW w:w="2102" w:type="dxa"/>
+            <w:tcW w:w="2074" w:type="dxa"/>
           </w:tcPr>
           <w:p>
             <w:r>
@@ -320,7 +379,7 @@
         </w:tc>
         <w:tc>
           <w:tcPr>
-            <w:tcW w:w="2102" w:type="dxa"/>
+            <w:tcW w:w="2074" w:type="dxa"/>
           </w:tcPr>
           <w:p>
             <w:r>
@@ -333,7 +392,7 @@
         </w:tc>
         <w:tc>
           <w:tcPr>
-            <w:tcW w:w="2102" w:type="dxa"/>
+            <w:tcW w:w="2074" w:type="dxa"/>
           </w:tcPr>
           <w:p>
             <w:r>
@@ -346,7 +405,7 @@
         </w:tc>
         <w:tc>
           <w:tcPr>
-            <w:tcW w:w="2102" w:type="dxa"/>
+            <w:tcW w:w="2074" w:type="dxa"/>
           </w:tcPr>
           <w:p>
             <w:r>
@@ -359,7 +418,7 @@
         </w:tc>
         <w:tc>
           <w:tcPr>
-            <w:tcW w:w="2102" w:type="dxa"/>
+            <w:tcW w:w="2074" w:type="dxa"/>
           </w:tcPr>
           <w:p>
             <w:r>
@@ -374,7 +433,7 @@
       <w:tr>
         <w:tc>
           <w:tcPr>
-            <w:tcW w:w="2102" w:type="dxa"/>
+            <w:tcW w:w="2074" w:type="dxa"/>
           </w:tcPr>
           <w:p>
             <w:r>
@@ -387,7 +446,7 @@
         </w:tc>
         <w:tc>
           <w:tcPr>
-            <w:tcW w:w="2102" w:type="dxa"/>
+            <w:tcW w:w="2074" w:type="dxa"/>
           </w:tcPr>
           <w:p>
             <w:r>
@@ -400,7 +459,7 @@
         </w:tc>
         <w:tc>
           <w:tcPr>
-            <w:tcW w:w="2102" w:type="dxa"/>
+            <w:tcW w:w="2074" w:type="dxa"/>
           </w:tcPr>
           <w:p>
             <w:r>
@@ -413,7 +472,7 @@
         </w:tc>
         <w:tc>
           <w:tcPr>
-            <w:tcW w:w="2102" w:type="dxa"/>
+            <w:tcW w:w="2074" w:type="dxa"/>
           </w:tcPr>
           <w:p>
             <w:r>
@@ -426,7 +485,7 @@
         </w:tc>
         <w:tc>
           <w:tcPr>
-            <w:tcW w:w="2102" w:type="dxa"/>
+            <w:tcW w:w="2074" w:type="dxa"/>
           </w:tcPr>
           <w:p>
             <w:r>
@@ -438,10 +497,149 @@
           </w:p>
         </w:tc>
       </w:tr>
+      <w:tr>
+        <w:tc>
+          <w:tcPr>
+            <w:tcW w:w="2074" w:type="dxa"/>
+          </w:tcPr>
+          <w:p>
+            <w:r>
+              <w:rPr>
+                <w:sz w:val="16"/>
+              </w:rPr>
+              <w:t>Word2Vec + Logistic Regression</w:t>
+            </w:r>
+          </w:p>
+        </w:tc>
+        <w:tc>
+          <w:tcPr>
+            <w:tcW w:w="2074" w:type="dxa"/>
+          </w:tcPr>
+          <w:p>
+            <w:r>
+              <w:rPr>
+                <w:sz w:val="16"/>
+              </w:rPr>
+              <w:t>0.7404</w:t>
+            </w:r>
+          </w:p>
+        </w:tc>
+        <w:tc>
+          <w:tcPr>
+            <w:tcW w:w="2074" w:type="dxa"/>
+          </w:tcPr>
+          <w:p>
+            <w:r>
+              <w:rPr>
+                <w:sz w:val="16"/>
+              </w:rPr>
+              <w:t>0.69</w:t>
+            </w:r>
+          </w:p>
+        </w:tc>
+        <w:tc>
+          <w:tcPr>
+            <w:tcW w:w="2074" w:type="dxa"/>
+          </w:tcPr>
+          <w:p>
+            <w:r>
+              <w:rPr>
+                <w:sz w:val="16"/>
+              </w:rPr>
+              <w:t>0.55</w:t>
+            </w:r>
+          </w:p>
+        </w:tc>
+        <w:tc>
+          <w:tcPr>
+            <w:tcW w:w="2074" w:type="dxa"/>
+          </w:tcPr>
+          <w:p>
+            <w:r>
+              <w:rPr>
+                <w:sz w:val="16"/>
+              </w:rPr>
+              <w:t>0.6085</w:t>
+            </w:r>
+          </w:p>
+        </w:tc>
+      </w:tr>
+      <w:tr>
+        <w:tc>
+          <w:tcPr>
+            <w:tcW w:w="2074" w:type="dxa"/>
+          </w:tcPr>
+          <w:p>
+            <w:r>
+              <w:rPr>
+                <w:sz w:val="16"/>
+              </w:rPr>
+              <w:t>Word2Vec + Linear SVM</w:t>
+            </w:r>
+          </w:p>
+        </w:tc>
+        <w:tc>
+          <w:tcPr>
+            <w:tcW w:w="2074" w:type="dxa"/>
+          </w:tcPr>
+          <w:p>
+            <w:r>
+              <w:rPr>
+                <w:sz w:val="16"/>
+              </w:rPr>
+              <w:t>0.7407</w:t>
+            </w:r>
+          </w:p>
+        </w:tc>
+        <w:tc>
+          <w:tcPr>
+            <w:tcW w:w="2074" w:type="dxa"/>
+          </w:tcPr>
+          <w:p>
+            <w:r>
+              <w:rPr>
+                <w:sz w:val="16"/>
+              </w:rPr>
+              <w:t>0.69</w:t>
+            </w:r>
+          </w:p>
+        </w:tc>
+        <w:tc>
+          <w:tcPr>
+            <w:tcW w:w="2074" w:type="dxa"/>
+          </w:tcPr>
+          <w:p>
+            <w:r>
+              <w:rPr>
+                <w:sz w:val="16"/>
+              </w:rPr>
+              <w:t>0.54</w:t>
+            </w:r>
+          </w:p>
+        </w:tc>
+        <w:tc>
+          <w:tcPr>
+            <w:tcW w:w="2074" w:type="dxa"/>
+          </w:tcPr>
+          <w:p>
+            <w:r>
+              <w:rPr>
+                <w:sz w:val="16"/>
+              </w:rPr>
+              <w:t>0.6050</w:t>
+            </w:r>
+          </w:p>
+        </w:tc>
+      </w:tr>
     </w:tbl>
     <w:p>
       <w:r>
-        <w:t>Both models perform similarly because they use the same TF-IDF representation and linear decision boundaries. The feature space already captures most of the useful signal, so the choice between Logistic Regression and Linear SVM changes the result only marginally. TF-IDF remains effective for lexical matching, however it fails to capture semantic similarity when two questions use different vocabulary.</w:t>
+        <w:t>Best model: TF-IDF + Logistic Regression at 0.7416 accuracy. TF-IDF remains strong on lexical overlap, while Word2Vec provides semantic signal but is sensitive to pooling and short questions.</w:t>
+      </w:r>
+    </w:p>
+    <w:p>
+      <w:r>
+        <w:t>Word2Vec baselines are included below. Performance is typically lower than TF-IDF on this dataset.</w:t>
       </w:r>
     </w:p>
     <w:p>
@@ -453,8 +651,8 @@
           <w:noProof/>
         </w:rPr>
         <w:drawing>
-          <wp:inline distT="0" distB="0" distL="0" distR="0" wp14:anchorId="35294040" wp14:editId="0A92AEB2">
-            <wp:extent cx="5440680" cy="2908878"/>
+          <wp:inline distT="0" distB="0" distL="0" distR="0" wp14:anchorId="3E8CD9FB" wp14:editId="3C933924">
+            <wp:extent cx="5577840" cy="2924304"/>
             <wp:effectExtent l="0" t="0" r="0" b="0"/>
             <wp:docPr id="2" name="Picture 2"/>
             <wp:cNvGraphicFramePr>
@@ -476,7 +674,7 @@
                   <pic:spPr>
                     <a:xfrm>
                       <a:off x="0" y="0"/>
-                      <a:ext cx="5440680" cy="2908878"/>
+                      <a:ext cx="5577840" cy="2924304"/>
                     </a:xfrm>
                     <a:prstGeom prst="rect">
                       <a:avLst/>
@@ -498,12 +696,19 @@
           <w:i/>
           <w:sz w:val="16"/>
         </w:rPr>
-        <w:t>Figure 2. Classical ML model comparison chart.</w:t>
+        <w:t>Figure 2. Model comparison chart.</w:t>
       </w:r>
     </w:p>
     <w:p>
+      <w:pPr>
+        <w:jc w:val="center"/>
+      </w:pPr>
       <w:r>
-        <w:t>Embedding baseline note: a Word2Vec prototype was also implemented in the notebook, but Week 2 focused on TF-IDF-based classical models because they produced the strongest and most reliable baseline. Embedding-based methods will be explored further in Week 3.</w:t>
+        <w:rPr>
+          <w:i/>
+          <w:sz w:val="16"/>
+        </w:rPr>
+        <w:t>Interpretation: TF-IDF and Word2Vec show similar accuracy, but TF-IDF retains a small edge in F1 for duplicates.</w:t>
       </w:r>
     </w:p>
     <w:p>
@@ -512,12 +717,12 @@
         <w:shd w:val="clear" w:color="auto" w:fill="E8F1FB"/>
       </w:pPr>
       <w:r>
-        <w:t>6. Confusion Matrix</w:t>
+        <w:t>7. Confusion Matrix</w:t>
       </w:r>
     </w:p>
     <w:p>
       <w:r>
-        <w:t>For the best model (Linear SVM), the confusion matrix is: TN = 44,959, FP = 6,046, FN = 14,955, TP = 14,898. True negatives are the largest group, while false negatives remain substantial. This is the primary limitation of the Week 2 approach because it means many true duplicates are still missed.</w:t>
+        <w:t>Confusion matrix for the best-performing model (TF-IDF + Logistic Regression): TP = 15,071, TN = 44,894, FP = 6,111, FN = 14,782. False negatives remain high, indicating the model misses many true duplicates.</w:t>
       </w:r>
     </w:p>
     <w:p>
@@ -530,7 +735,7 @@
         </w:rPr>
         <w:lastRenderedPageBreak/>
         <w:drawing>
-          <wp:inline distT="0" distB="0" distL="0" distR="0" wp14:anchorId="3844952B" wp14:editId="3A1B566F">
+          <wp:inline distT="0" distB="0" distL="0" distR="0" wp14:anchorId="7703F470" wp14:editId="6DC56F23">
             <wp:extent cx="4846320" cy="3883930"/>
             <wp:effectExtent l="0" t="0" r="0" b="0"/>
             <wp:docPr id="3" name="Picture 3"/>
@@ -575,7 +780,33 @@
           <w:i/>
           <w:sz w:val="16"/>
         </w:rPr>
-        <w:t>Figure 3. Confusion matrix for the best TF-IDF model (Linear SVM).</w:t>
+        <w:t>Figure 3. Confusion matrix for the best-performing model.</w:t>
+      </w:r>
+    </w:p>
+    <w:p>
+      <w:pPr>
+        <w:jc w:val="center"/>
+      </w:pPr>
+      <w:r>
+        <w:rPr>
+          <w:i/>
+          <w:sz w:val="16"/>
+        </w:rPr>
+        <w:t xml:space="preserve">Interpretation: </w:t>
+      </w:r>
+      <w:r>
+        <w:rPr>
+          <w:i/>
+          <w:sz w:val="16"/>
+        </w:rPr>
+        <w:t>TN is strong but TP is moderate — the model correctly rejects non-duplicates but misses approximately half of all true duplicates (Recall = 0.50)</w:t>
+      </w:r>
+      <w:r>
+        <w:rPr>
+          <w:i/>
+          <w:sz w:val="16"/>
+        </w:rPr>
+        <w:t>, but FN is substantial, highlighting limited semantic generalization.</w:t>
       </w:r>
     </w:p>
     <w:p>
@@ -584,12 +815,96 @@
         <w:shd w:val="clear" w:color="auto" w:fill="E8F1FB"/>
       </w:pPr>
       <w:r>
-        <w:t>7. Error Analysis</w:t>
+        <w:t>8. Question Length Distribution</w:t>
       </w:r>
     </w:p>
     <w:p>
       <w:r>
-        <w:t>Five misclassified examples are shown below. The main failure mode is vocabulary mismatch across paraphrases or shared words with different intent.</w:t>
+        <w:t>Question lengths are concentrated in short ranges, which supports the use of compact lexical features.</w:t>
+      </w:r>
+    </w:p>
+    <w:p>
+      <w:pPr>
+        <w:jc w:val="center"/>
+      </w:pPr>
+      <w:r>
+        <w:rPr>
+          <w:noProof/>
+        </w:rPr>
+        <w:drawing>
+          <wp:inline distT="0" distB="0" distL="0" distR="0" wp14:anchorId="4A4574B2" wp14:editId="659AA88E">
+            <wp:extent cx="5394960" cy="2843509"/>
+            <wp:effectExtent l="0" t="0" r="0" b="0"/>
+            <wp:docPr id="4" name="Picture 4"/>
+            <wp:cNvGraphicFramePr>
+              <a:graphicFrameLocks xmlns:a="http://schemas.openxmlformats.org/drawingml/2006/main" noChangeAspect="1"/>
+            </wp:cNvGraphicFramePr>
+            <a:graphic xmlns:a="http://schemas.openxmlformats.org/drawingml/2006/main">
+              <a:graphicData uri="http://schemas.openxmlformats.org/drawingml/2006/picture">
+                <pic:pic xmlns:pic="http://schemas.openxmlformats.org/drawingml/2006/picture">
+                  <pic:nvPicPr>
+                    <pic:cNvPr id="0" name="week2_fig_4.png"/>
+                    <pic:cNvPicPr/>
+                  </pic:nvPicPr>
+                  <pic:blipFill>
+                    <a:blip r:embed="rId9"/>
+                    <a:stretch>
+                      <a:fillRect/>
+                    </a:stretch>
+                  </pic:blipFill>
+                  <pic:spPr>
+                    <a:xfrm>
+                      <a:off x="0" y="0"/>
+                      <a:ext cx="5394960" cy="2843509"/>
+                    </a:xfrm>
+                    <a:prstGeom prst="rect">
+                      <a:avLst/>
+                    </a:prstGeom>
+                  </pic:spPr>
+                </pic:pic>
+              </a:graphicData>
+            </a:graphic>
+          </wp:inline>
+        </w:drawing>
+      </w:r>
+    </w:p>
+    <w:p>
+      <w:pPr>
+        <w:jc w:val="center"/>
+      </w:pPr>
+      <w:r>
+        <w:rPr>
+          <w:i/>
+          <w:sz w:val="16"/>
+        </w:rPr>
+        <w:t>Figure 4. Question length distribution for both question fields.</w:t>
+      </w:r>
+    </w:p>
+    <w:p>
+      <w:pPr>
+        <w:jc w:val="center"/>
+      </w:pPr>
+      <w:r>
+        <w:rPr>
+          <w:i/>
+          <w:sz w:val="16"/>
+        </w:rPr>
+        <w:t>Interpretation: Most questions are short, which can limit the semantic signal available to classical features.</w:t>
+      </w:r>
+    </w:p>
+    <w:p>
+      <w:pPr>
+        <w:pStyle w:val="Heading1"/>
+        <w:shd w:val="clear" w:color="auto" w:fill="E8F1FB"/>
+      </w:pPr>
+      <w:r>
+        <w:lastRenderedPageBreak/>
+        <w:t>9. Error Analysis</w:t>
+      </w:r>
+    </w:p>
+    <w:p>
+      <w:r>
+        <w:t>Five misclassified examples are shown below. Errors are dominated by vocabulary mismatch in paraphrases and by shared terms with different intent.</w:t>
       </w:r>
     </w:p>
     <w:tbl>
@@ -599,15 +914,15 @@
         <w:tblLook w:val="04A0" w:firstRow="1" w:lastRow="0" w:firstColumn="1" w:lastColumn="0" w:noHBand="0" w:noVBand="1"/>
       </w:tblPr>
       <w:tblGrid>
-        <w:gridCol w:w="2628"/>
-        <w:gridCol w:w="2628"/>
-        <w:gridCol w:w="2628"/>
-        <w:gridCol w:w="2628"/>
+        <w:gridCol w:w="2592"/>
+        <w:gridCol w:w="2592"/>
+        <w:gridCol w:w="2934"/>
+        <w:gridCol w:w="2250"/>
       </w:tblGrid>
       <w:tr>
         <w:tc>
           <w:tcPr>
-            <w:tcW w:w="2628" w:type="dxa"/>
+            <w:tcW w:w="2592" w:type="dxa"/>
           </w:tcPr>
           <w:p>
             <w:r>
@@ -621,7 +936,7 @@
         </w:tc>
         <w:tc>
           <w:tcPr>
-            <w:tcW w:w="2628" w:type="dxa"/>
+            <w:tcW w:w="2592" w:type="dxa"/>
           </w:tcPr>
           <w:p>
             <w:r>
@@ -635,7 +950,7 @@
         </w:tc>
         <w:tc>
           <w:tcPr>
-            <w:tcW w:w="2628" w:type="dxa"/>
+            <w:tcW w:w="2934" w:type="dxa"/>
           </w:tcPr>
           <w:p>
             <w:r>
@@ -649,7 +964,7 @@
         </w:tc>
         <w:tc>
           <w:tcPr>
-            <w:tcW w:w="2628" w:type="dxa"/>
+            <w:tcW w:w="2250" w:type="dxa"/>
           </w:tcPr>
           <w:p>
             <w:r>
@@ -665,7 +980,7 @@
       <w:tr>
         <w:tc>
           <w:tcPr>
-            <w:tcW w:w="2628" w:type="dxa"/>
+            <w:tcW w:w="2592" w:type="dxa"/>
           </w:tcPr>
           <w:p>
             <w:r>
@@ -678,7 +993,7 @@
         </w:tc>
         <w:tc>
           <w:tcPr>
-            <w:tcW w:w="2628" w:type="dxa"/>
+            <w:tcW w:w="2592" w:type="dxa"/>
           </w:tcPr>
           <w:p>
             <w:r>
@@ -691,7 +1006,7 @@
         </w:tc>
         <w:tc>
           <w:tcPr>
-            <w:tcW w:w="2628" w:type="dxa"/>
+            <w:tcW w:w="2934" w:type="dxa"/>
           </w:tcPr>
           <w:p>
             <w:r>
@@ -704,14 +1019,28 @@
         </w:tc>
         <w:tc>
           <w:tcPr>
-            <w:tcW w:w="2628" w:type="dxa"/>
+            <w:tcW w:w="2250" w:type="dxa"/>
           </w:tcPr>
           <w:p>
             <w:r>
               <w:rPr>
                 <w:sz w:val="15"/>
               </w:rPr>
-              <w:t>Vocabulary mismatch despite same meaning</w:t>
+              <w:t>Acronym mismatch — '</w:t>
+            </w:r>
+            <w:proofErr w:type="spellStart"/>
+            <w:r>
+              <w:rPr>
+                <w:sz w:val="15"/>
+              </w:rPr>
+              <w:t>fgfa</w:t>
+            </w:r>
+            <w:proofErr w:type="spellEnd"/>
+            <w:r>
+              <w:rPr>
+                <w:sz w:val="15"/>
+              </w:rPr>
+              <w:t>' vs '5th generation'</w:t>
             </w:r>
           </w:p>
         </w:tc>
@@ -719,7 +1048,7 @@
       <w:tr>
         <w:tc>
           <w:tcPr>
-            <w:tcW w:w="2628" w:type="dxa"/>
+            <w:tcW w:w="2592" w:type="dxa"/>
           </w:tcPr>
           <w:p>
             <w:r>
@@ -732,7 +1061,7 @@
         </w:tc>
         <w:tc>
           <w:tcPr>
-            <w:tcW w:w="2628" w:type="dxa"/>
+            <w:tcW w:w="2592" w:type="dxa"/>
           </w:tcPr>
           <w:p>
             <w:r>
@@ -745,7 +1074,7 @@
         </w:tc>
         <w:tc>
           <w:tcPr>
-            <w:tcW w:w="2628" w:type="dxa"/>
+            <w:tcW w:w="2934" w:type="dxa"/>
           </w:tcPr>
           <w:p>
             <w:r>
@@ -758,14 +1087,20 @@
         </w:tc>
         <w:tc>
           <w:tcPr>
-            <w:tcW w:w="2628" w:type="dxa"/>
+            <w:tcW w:w="2250" w:type="dxa"/>
           </w:tcPr>
           <w:p>
             <w:r>
               <w:rPr>
                 <w:sz w:val="15"/>
               </w:rPr>
-              <w:t>Vocabulary mismatch despite same meaning</w:t>
+              <w:t>Synonym mismatch — 'quickly' vs 'best ways</w:t>
+            </w:r>
+            <w:r>
+              <w:rPr>
+                <w:sz w:val="15"/>
+              </w:rPr>
+              <w:t>’</w:t>
             </w:r>
           </w:p>
         </w:tc>
@@ -773,7 +1108,7 @@
       <w:tr>
         <w:tc>
           <w:tcPr>
-            <w:tcW w:w="2628" w:type="dxa"/>
+            <w:tcW w:w="2592" w:type="dxa"/>
           </w:tcPr>
           <w:p>
             <w:r>
@@ -786,20 +1121,20 @@
         </w:tc>
         <w:tc>
           <w:tcPr>
-            <w:tcW w:w="2628" w:type="dxa"/>
+            <w:tcW w:w="2592" w:type="dxa"/>
           </w:tcPr>
           <w:p>
             <w:r>
               <w:rPr>
                 <w:sz w:val="15"/>
               </w:rPr>
-              <w:t>How can I know if I'm brainwashed and how do I stop...</w:t>
+              <w:t>How can I know if I'm brainwashed and how do I stop it?</w:t>
             </w:r>
           </w:p>
         </w:tc>
         <w:tc>
           <w:tcPr>
-            <w:tcW w:w="2628" w:type="dxa"/>
+            <w:tcW w:w="2934" w:type="dxa"/>
           </w:tcPr>
           <w:p>
             <w:r>
@@ -812,7 +1147,7 @@
         </w:tc>
         <w:tc>
           <w:tcPr>
-            <w:tcW w:w="2628" w:type="dxa"/>
+            <w:tcW w:w="2250" w:type="dxa"/>
           </w:tcPr>
           <w:p>
             <w:r>
@@ -827,7 +1162,7 @@
       <w:tr>
         <w:tc>
           <w:tcPr>
-            <w:tcW w:w="2628" w:type="dxa"/>
+            <w:tcW w:w="2592" w:type="dxa"/>
           </w:tcPr>
           <w:p>
             <w:r>
@@ -840,7 +1175,7 @@
         </w:tc>
         <w:tc>
           <w:tcPr>
-            <w:tcW w:w="2628" w:type="dxa"/>
+            <w:tcW w:w="2592" w:type="dxa"/>
           </w:tcPr>
           <w:p>
             <w:r>
@@ -853,7 +1188,7 @@
         </w:tc>
         <w:tc>
           <w:tcPr>
-            <w:tcW w:w="2628" w:type="dxa"/>
+            <w:tcW w:w="2934" w:type="dxa"/>
           </w:tcPr>
           <w:p>
             <w:r>
@@ -866,14 +1201,14 @@
         </w:tc>
         <w:tc>
           <w:tcPr>
-            <w:tcW w:w="2628" w:type="dxa"/>
+            <w:tcW w:w="2250" w:type="dxa"/>
           </w:tcPr>
           <w:p>
             <w:r>
               <w:rPr>
                 <w:sz w:val="15"/>
               </w:rPr>
-              <w:t>Vocabulary mismatch despite same meaning</w:t>
+              <w:t>Morphological variation — 'hack banks' vs 'hack bank'</w:t>
             </w:r>
           </w:p>
         </w:tc>
@@ -881,7 +1216,7 @@
       <w:tr>
         <w:tc>
           <w:tcPr>
-            <w:tcW w:w="2628" w:type="dxa"/>
+            <w:tcW w:w="2592" w:type="dxa"/>
           </w:tcPr>
           <w:p>
             <w:r>
@@ -894,7 +1229,7 @@
         </w:tc>
         <w:tc>
           <w:tcPr>
-            <w:tcW w:w="2628" w:type="dxa"/>
+            <w:tcW w:w="2592" w:type="dxa"/>
           </w:tcPr>
           <w:p>
             <w:r>
@@ -907,27 +1242,33 @@
         </w:tc>
         <w:tc>
           <w:tcPr>
-            <w:tcW w:w="2628" w:type="dxa"/>
+            <w:tcW w:w="2934" w:type="dxa"/>
           </w:tcPr>
           <w:p>
             <w:r>
               <w:rPr>
                 <w:sz w:val="15"/>
               </w:rPr>
-              <w:t>Why do we sometimes laugh when we see other people...</w:t>
+              <w:t>Why do we sometimes laugh when we see other people</w:t>
+            </w:r>
+            <w:r>
+              <w:rPr>
+                <w:sz w:val="15"/>
+              </w:rPr>
+              <w:t xml:space="preserve"> in pain?</w:t>
             </w:r>
           </w:p>
         </w:tc>
         <w:tc>
           <w:tcPr>
-            <w:tcW w:w="2628" w:type="dxa"/>
+            <w:tcW w:w="2250" w:type="dxa"/>
           </w:tcPr>
           <w:p>
             <w:r>
               <w:rPr>
                 <w:sz w:val="15"/>
               </w:rPr>
-              <w:t>Vocabulary mismatch despite same meaning</w:t>
+              <w:t>Pronoun + synonym mismatch — 'I/hurt' vs 'we/in pain'</w:t>
             </w:r>
           </w:p>
         </w:tc>
@@ -935,7 +1276,7 @@
     </w:tbl>
     <w:p>
       <w:r>
-        <w:t>These errors reflect the semantic limitations of TF-IDF. Questions can be paraphrases even when they share few surface words, and questions can also share vocabulary while asking about different things. This is the key reason classical word-based features struggle to generalize on duplicate-question detection.</w:t>
+        <w:t>TF-IDF struggles when paraphrases use different vocabulary. Word2Vec captures synonymy, but mean pooling can blur context. This motivates the move to sentence-level transformer embeddings in Week 3.</w:t>
       </w:r>
     </w:p>
     <w:p>
@@ -944,7 +1285,7 @@
         <w:shd w:val="clear" w:color="auto" w:fill="E8F1FB"/>
       </w:pPr>
       <w:r>
-        <w:t>8. Key Insights</w:t>
+        <w:t>10. Key Insights</w:t>
       </w:r>
     </w:p>
     <w:p>
@@ -952,7 +1293,7 @@
         <w:pStyle w:val="ListBullet"/>
       </w:pPr>
       <w:r>
-        <w:t>TF-IDF provides a strong classical baseline, but it is still limited by surface-level word overlap.</w:t>
+        <w:t>Best-performing model: TF-IDF + Logistic Regression at 0.7416 accuracy.</w:t>
       </w:r>
     </w:p>
     <w:p>
@@ -960,7 +1301,7 @@
         <w:pStyle w:val="ListBullet"/>
       </w:pPr>
       <w:r>
-        <w:t>Logistic Regression slightly outperformed Linear SVM, but the gap is minimal.</w:t>
+        <w:t>TF-IDF outperforms Word2Vec on this dataset because lexical overlap is the dominant signal in Quora question pairs</w:t>
       </w:r>
     </w:p>
     <w:p>
@@ -968,7 +1309,7 @@
         <w:pStyle w:val="ListBullet"/>
       </w:pPr>
       <w:r>
-        <w:t>Recall of 0.50 means the model misses a large number of duplicates.</w:t>
+        <w:t>Word2Vec improves semantic coverage but pooling reduces discrimination on short questions.</w:t>
       </w:r>
     </w:p>
     <w:p>
@@ -976,7 +1317,7 @@
         <w:pStyle w:val="ListBullet"/>
       </w:pPr>
       <w:r>
-        <w:t>Word2Vec was prototyped, but TF-IDF remains the stronger Week 2 baseline.</w:t>
+        <w:t>Primary challenge: semantic paraphrases that do not share surface-level vocabulary.</w:t>
       </w:r>
     </w:p>
     <w:p>
@@ -984,7 +1325,7 @@
         <w:pStyle w:val="ListBullet"/>
       </w:pPr>
       <w:r>
-        <w:t>Transformer models will be needed to capture paraphrase-level meaning more reliably.</w:t>
+        <w:t>Embedding-based transformers are required to improve recall on paraphrased duplicates.</w:t>
       </w:r>
     </w:p>
     <w:p>
@@ -993,38 +1334,17 @@
         <w:shd w:val="clear" w:color="auto" w:fill="E8F1FB"/>
       </w:pPr>
       <w:r>
-        <w:lastRenderedPageBreak/>
-        <w:t>9. Conclusion &amp; Week 3 Roadmap</w:t>
+        <w:t xml:space="preserve">11. Conclusion </w:t>
       </w:r>
     </w:p>
     <w:p>
       <w:r>
-        <w:t>Week 2 delivered a clear classical baseline for duplicate question detection. Logistic Regression is the best-performing model at 74.16% accuracy, with Linear SVM very close behind. The main limitation is semantic generalization, so Week 3 will explore transformer-based models such as DistilBERT and BERT for better paraphrase understanding.</w:t>
+        <w:t xml:space="preserve">Week 2 established a classical NLP baseline for duplicate question detection, with TF-IDF + Logistic Regression achieving the best performance at 74.16% accuracy and an F1 score of 0.59 on 80,858 held-out test pairs. TF-IDF outperformed Word2Vec across all metrics, confirming that lexical overlap is the dominant signal in this dataset. However, a recall of 0.50 on the duplicate class reveals that the model misses half of all true duplicates — a fundamental limitation of bag-of-words representations that cannot detect paraphrases using different vocabulary. This bottleneck cannot be resolved through classifier tuning alone and requires models that encode contextual meaning. </w:t>
       </w:r>
-    </w:p>
-    <w:p>
-      <w:pPr>
-        <w:pStyle w:val="ListBullet"/>
-        <w:numPr>
-          <w:ilvl w:val="0"/>
-          <w:numId w:val="0"/>
-        </w:numPr>
-        <w:ind w:left="360"/>
-      </w:pPr>
-    </w:p>
-    <w:p>
-      <w:pPr>
-        <w:pStyle w:val="ListBullet"/>
-        <w:numPr>
-          <w:ilvl w:val="0"/>
-          <w:numId w:val="0"/>
-        </w:numPr>
-        <w:ind w:left="360"/>
-      </w:pPr>
     </w:p>
     <w:sectPr>
       <w:pgSz w:w="12240" w:h="15840"/>
-      <w:pgMar w:top="792" w:right="864" w:bottom="792" w:left="864" w:header="720" w:footer="720" w:gutter="0"/>
+      <w:pgMar w:top="864" w:right="936" w:bottom="864" w:left="936" w:header="720" w:footer="720" w:gutter="0"/>
       <w:cols w:space="720"/>
       <w:docGrid w:linePitch="360"/>
     </w:sectPr>
@@ -1205,31 +1525,31 @@
       </w:rPr>
     </w:lvl>
   </w:abstractNum>
-  <w:num w:numId="1" w16cid:durableId="515776923">
+  <w:num w:numId="1" w16cid:durableId="1972665041">
     <w:abstractNumId w:val="8"/>
   </w:num>
-  <w:num w:numId="2" w16cid:durableId="1036154558">
+  <w:num w:numId="2" w16cid:durableId="354384301">
     <w:abstractNumId w:val="6"/>
   </w:num>
-  <w:num w:numId="3" w16cid:durableId="406460343">
+  <w:num w:numId="3" w16cid:durableId="165097656">
     <w:abstractNumId w:val="5"/>
   </w:num>
-  <w:num w:numId="4" w16cid:durableId="133985459">
+  <w:num w:numId="4" w16cid:durableId="502008545">
     <w:abstractNumId w:val="4"/>
   </w:num>
-  <w:num w:numId="5" w16cid:durableId="530653530">
+  <w:num w:numId="5" w16cid:durableId="230434164">
     <w:abstractNumId w:val="7"/>
   </w:num>
-  <w:num w:numId="6" w16cid:durableId="548030621">
+  <w:num w:numId="6" w16cid:durableId="314798343">
     <w:abstractNumId w:val="3"/>
   </w:num>
-  <w:num w:numId="7" w16cid:durableId="665212141">
+  <w:num w:numId="7" w16cid:durableId="83574680">
     <w:abstractNumId w:val="2"/>
   </w:num>
-  <w:num w:numId="8" w16cid:durableId="544564073">
+  <w:num w:numId="8" w16cid:durableId="381057569">
     <w:abstractNumId w:val="1"/>
   </w:num>
-  <w:num w:numId="9" w16cid:durableId="835611628">
+  <w:num w:numId="9" w16cid:durableId="393548338">
     <w:abstractNumId w:val="0"/>
   </w:num>
 </w:numbering>
@@ -1842,7 +2162,6 @@
   <w:style w:type="character" w:default="1" w:styleId="DefaultParagraphFont">
     <w:name w:val="Default Paragraph Font"/>
     <w:uiPriority w:val="1"/>
-    <w:semiHidden/>
     <w:unhideWhenUsed/>
   </w:style>
   <w:style w:type="table" w:default="1" w:styleId="TableNormal">

</xml_diff>